<commit_message>
PhD directory at 7.10.26 3.5 weeks after start
</commit_message>
<xml_diff>
--- a/scientific_literature/Notes about Exzitonic physics.docx
+++ b/scientific_literature/Notes about Exzitonic physics.docx
@@ -481,6 +481,128 @@
       </w:r>
     </w:p>
     <w:p>
+      <w:proofErr w:type="spellStart"/>
+      <w:r>
+        <w:t>Excitons</w:t>
+      </w:r>
+      <w:proofErr w:type="spellEnd"/>
+      <w:r>
+        <w:t xml:space="preserve"> </w:t>
+      </w:r>
+      <w:proofErr w:type="spellStart"/>
+      <w:r>
+        <w:t>can</w:t>
+      </w:r>
+      <w:proofErr w:type="spellEnd"/>
+      <w:r>
+        <w:t xml:space="preserve"> </w:t>
+      </w:r>
+      <w:proofErr w:type="spellStart"/>
+      <w:r>
+        <w:t>dissocialte</w:t>
+      </w:r>
+      <w:proofErr w:type="spellEnd"/>
+      <w:r>
+        <w:t xml:space="preserve"> in a </w:t>
+      </w:r>
+      <w:proofErr w:type="spellStart"/>
+      <w:r>
+        <w:t>free</w:t>
+      </w:r>
+      <w:proofErr w:type="spellEnd"/>
+      <w:r>
+        <w:t xml:space="preserve"> hole and </w:t>
+      </w:r>
+      <w:proofErr w:type="spellStart"/>
+      <w:r>
+        <w:t>free</w:t>
+      </w:r>
+      <w:proofErr w:type="spellEnd"/>
+      <w:r>
+        <w:t xml:space="preserve"> </w:t>
+      </w:r>
+      <w:proofErr w:type="spellStart"/>
+      <w:r>
+        <w:t>elctron</w:t>
+      </w:r>
+      <w:proofErr w:type="spellEnd"/>
+      <w:r>
+        <w:t xml:space="preserve">. This </w:t>
+      </w:r>
+      <w:proofErr w:type="spellStart"/>
+      <w:r>
+        <w:t>dissociation</w:t>
+      </w:r>
+      <w:proofErr w:type="spellEnd"/>
+      <w:r>
+        <w:t xml:space="preserve"> </w:t>
+      </w:r>
+      <w:proofErr w:type="spellStart"/>
+      <w:r>
+        <w:t>enhances</w:t>
+      </w:r>
+      <w:proofErr w:type="spellEnd"/>
+      <w:r>
+        <w:t xml:space="preserve"> the </w:t>
+      </w:r>
+      <w:proofErr w:type="spellStart"/>
+      <w:r>
+        <w:t>efficiency</w:t>
+      </w:r>
+      <w:proofErr w:type="spellEnd"/>
+      <w:r>
+        <w:t xml:space="preserve"> of solar </w:t>
+      </w:r>
+      <w:proofErr w:type="spellStart"/>
+      <w:r>
+        <w:t>cells</w:t>
+      </w:r>
+      <w:proofErr w:type="spellEnd"/>
+      <w:r>
+        <w:t xml:space="preserve"> and </w:t>
+      </w:r>
+      <w:proofErr w:type="spellStart"/>
+      <w:r>
+        <w:t>photo</w:t>
+      </w:r>
+      <w:proofErr w:type="spellEnd"/>
+      <w:r>
+        <w:t>(</w:t>
+      </w:r>
+      <w:proofErr w:type="spellStart"/>
+      <w:r>
+        <w:t>electro</w:t>
+      </w:r>
+      <w:proofErr w:type="spellEnd"/>
+      <w:r>
+        <w:t>)</w:t>
+      </w:r>
+      <w:proofErr w:type="spellStart"/>
+      <w:r>
+        <w:t>catalytic</w:t>
+      </w:r>
+      <w:proofErr w:type="spellEnd"/>
+      <w:r>
+        <w:t xml:space="preserve"> </w:t>
+      </w:r>
+      <w:proofErr w:type="spellStart"/>
+      <w:r>
+        <w:t>reactions</w:t>
+      </w:r>
+      <w:proofErr w:type="spellEnd"/>
+      <w:r>
+        <w:t xml:space="preserve"> in 2D </w:t>
+      </w:r>
+      <w:proofErr w:type="spellStart"/>
+      <w:r>
+        <w:t>materials</w:t>
+      </w:r>
+      <w:proofErr w:type="spellEnd"/>
+      <w:r>
+        <w:t xml:space="preserve">. </w:t>
+      </w:r>
+    </w:p>
+    <w:p>
       <w:r>
         <w:t xml:space="preserve">Special </w:t>
       </w:r>
@@ -595,6 +717,203 @@
       <w:proofErr w:type="spellEnd"/>
       <w:r>
         <w:t xml:space="preserve">). </w:t>
+      </w:r>
+    </w:p>
+    <w:p>
+      <w:proofErr w:type="spellStart"/>
+      <w:r>
+        <w:t>Exciton</w:t>
+      </w:r>
+      <w:proofErr w:type="spellEnd"/>
+      <w:r>
+        <w:t xml:space="preserve"> </w:t>
+      </w:r>
+      <w:proofErr w:type="spellStart"/>
+      <w:r>
+        <w:t>states</w:t>
+      </w:r>
+      <w:proofErr w:type="spellEnd"/>
+      <w:r>
+        <w:t xml:space="preserve"> </w:t>
+      </w:r>
+      <w:proofErr w:type="spellStart"/>
+      <w:r>
+        <w:t>have</w:t>
+      </w:r>
+      <w:proofErr w:type="spellEnd"/>
+      <w:r>
+        <w:t xml:space="preserve"> a different </w:t>
+      </w:r>
+      <w:proofErr w:type="spellStart"/>
+      <w:r>
+        <w:t>parity</w:t>
+      </w:r>
+      <w:proofErr w:type="spellEnd"/>
+      <w:r>
+        <w:t xml:space="preserve">, not so </w:t>
+      </w:r>
+      <w:proofErr w:type="spellStart"/>
+      <w:r>
+        <w:t>far</w:t>
+      </w:r>
+      <w:proofErr w:type="spellEnd"/>
+      <w:r>
+        <w:t xml:space="preserve"> </w:t>
+      </w:r>
+      <w:proofErr w:type="spellStart"/>
+      <w:r>
+        <w:t>sure</w:t>
+      </w:r>
+      <w:proofErr w:type="spellEnd"/>
+      <w:r>
+        <w:t xml:space="preserve"> </w:t>
+      </w:r>
+      <w:proofErr w:type="spellStart"/>
+      <w:r>
+        <w:t>what</w:t>
+      </w:r>
+      <w:proofErr w:type="spellEnd"/>
+      <w:r>
+        <w:t xml:space="preserve"> </w:t>
+      </w:r>
+      <w:proofErr w:type="spellStart"/>
+      <w:r>
+        <w:t>this</w:t>
+      </w:r>
+      <w:proofErr w:type="spellEnd"/>
+      <w:r>
+        <w:t xml:space="preserve"> </w:t>
+      </w:r>
+      <w:proofErr w:type="spellStart"/>
+      <w:r>
+        <w:t>means</w:t>
+      </w:r>
+      <w:proofErr w:type="spellEnd"/>
+      <w:r>
+        <w:t xml:space="preserve">. </w:t>
+      </w:r>
+    </w:p>
+    <w:p/>
+    <w:p>
+      <w:r>
+        <w:t xml:space="preserve">Information </w:t>
+      </w:r>
+      <w:proofErr w:type="spellStart"/>
+      <w:r>
+        <w:t>about</w:t>
+      </w:r>
+      <w:proofErr w:type="spellEnd"/>
+      <w:r>
+        <w:t xml:space="preserve"> </w:t>
+      </w:r>
+      <w:proofErr w:type="spellStart"/>
+      <w:r>
+        <w:t>example</w:t>
+      </w:r>
+      <w:proofErr w:type="spellEnd"/>
+      <w:r>
+        <w:t xml:space="preserve"> </w:t>
+      </w:r>
+      <w:proofErr w:type="spellStart"/>
+      <w:r>
+        <w:t>systems</w:t>
+      </w:r>
+      <w:proofErr w:type="spellEnd"/>
+      <w:r>
+        <w:t xml:space="preserve">: </w:t>
+      </w:r>
+    </w:p>
+    <w:p>
+      <w:r>
+        <w:t>WS2: non-</w:t>
+      </w:r>
+      <w:proofErr w:type="spellStart"/>
+      <w:r>
+        <w:t>degenerate</w:t>
+      </w:r>
+      <w:proofErr w:type="spellEnd"/>
+      <w:r>
+        <w:t xml:space="preserve"> </w:t>
+      </w:r>
+      <w:proofErr w:type="spellStart"/>
+      <w:r>
+        <w:t>excited</w:t>
+      </w:r>
+      <w:proofErr w:type="spellEnd"/>
+      <w:r>
+        <w:t xml:space="preserve"> </w:t>
+      </w:r>
+      <w:proofErr w:type="spellStart"/>
+      <w:r>
+        <w:t>excitonic</w:t>
+      </w:r>
+      <w:proofErr w:type="spellEnd"/>
+      <w:r>
+        <w:t xml:space="preserve"> </w:t>
+      </w:r>
+      <w:proofErr w:type="spellStart"/>
+      <w:r>
+        <w:t>states</w:t>
+      </w:r>
+      <w:proofErr w:type="spellEnd"/>
+      <w:r>
+        <w:t xml:space="preserve"> </w:t>
+      </w:r>
+      <w:proofErr w:type="spellStart"/>
+      <w:r>
+        <w:t>where</w:t>
+      </w:r>
+      <w:proofErr w:type="spellEnd"/>
+      <w:r>
+        <w:t xml:space="preserve"> </w:t>
+      </w:r>
+      <w:proofErr w:type="spellStart"/>
+      <w:r>
+        <w:t>states</w:t>
+      </w:r>
+      <w:proofErr w:type="spellEnd"/>
+      <w:r>
+        <w:t xml:space="preserve"> </w:t>
+      </w:r>
+      <w:proofErr w:type="spellStart"/>
+      <w:r>
+        <w:t>with</w:t>
+      </w:r>
+      <w:proofErr w:type="spellEnd"/>
+      <w:r>
+        <w:t xml:space="preserve"> the same n but a different orbital mo</w:t>
+      </w:r>
+      <w:proofErr w:type="spellStart"/>
+      <w:r>
+        <w:t>mentum</w:t>
+      </w:r>
+      <w:proofErr w:type="spellEnd"/>
+      <w:r>
+        <w:t xml:space="preserve"> </w:t>
+      </w:r>
+      <w:proofErr w:type="spellStart"/>
+      <w:r>
+        <w:t>quantum</w:t>
+      </w:r>
+      <w:proofErr w:type="spellEnd"/>
+      <w:r>
+        <w:t xml:space="preserve"> </w:t>
+      </w:r>
+      <w:proofErr w:type="spellStart"/>
+      <w:r>
+        <w:t>energetically</w:t>
+      </w:r>
+      <w:proofErr w:type="spellEnd"/>
+      <w:r>
+        <w:t xml:space="preserve"> </w:t>
+      </w:r>
+      <w:proofErr w:type="spellStart"/>
+      <w:r>
+        <w:t>differ</w:t>
+      </w:r>
+      <w:proofErr w:type="spellEnd"/>
+      <w:r>
+        <w:t xml:space="preserve">. </w:t>
       </w:r>
     </w:p>
     <w:sectPr>

</xml_diff>